<commit_message>
Add TN patient count to analysis and report
</commit_message>
<xml_diff>
--- a/outputs/docs/sepsis_project_report.docx
+++ b/outputs/docs/sepsis_project_report.docx
@@ -2103,6 +2103,313 @@
       </w:r>
     </w:p>
     <w:p>
+      <w:pPr/>
+      <w:r>
+        <w:t>Patient-Level Performance Summary</w:t>
+      </w:r>
+    </w:p>
+    <w:p>
+      <w:pPr/>
+      <w:r>
+        <w:t>Each of the 6,051 validation patients generates multiple hourly predictions (average ~39 per patient), resulting in 236,654 total samples. The utility score is computed at the sample level, while clinical interpretation focuses on patient-level outcomes. True negative patients (71.1%) represent stable ICU patients correctly identified as non-septic throughout their stay.</w:t>
+      </w:r>
+    </w:p>
+    <w:p>
+      <w:pPr/>
+      <w:r>
+        <w:t>True negative analysis reveals the model's ability to correctly identify 4,303 non-septic patients (71.1% of validation set) without triggering false alarms. These patients maintained prediction scores of 0.01-0.06 throughout their ICU stay, demonstrating the model handles normal physiological variation appropriately.</w:t>
+      </w:r>
+    </w:p>
+    <w:tbl>
+      <w:tblPr>
+        <w:tblStyle w:val="TableGrid"/>
+        <w:tblW w:type="auto" w:w="0"/>
+        <w:tblLook w:firstColumn="1" w:firstRow="1" w:lastColumn="0" w:lastRow="0" w:noHBand="0" w:noVBand="1" w:val="04A0"/>
+      </w:tblPr>
+      <w:tblGrid>
+        <w:gridCol w:w="2160"/>
+        <w:gridCol w:w="2160"/>
+        <w:gridCol w:w="2160"/>
+        <w:gridCol w:w="2160"/>
+      </w:tblGrid>
+      <w:tr>
+        <w:tc>
+          <w:tcPr>
+            <w:tcW w:type="dxa" w:w="2160"/>
+          </w:tcPr>
+          <w:p>
+            <w:r>
+              <w:rPr>
+                <w:b/>
+              </w:rPr>
+              <w:t>Category</w:t>
+            </w:r>
+          </w:p>
+        </w:tc>
+        <w:tc>
+          <w:tcPr>
+            <w:tcW w:type="dxa" w:w="2160"/>
+          </w:tcPr>
+          <w:p>
+            <w:r>
+              <w:rPr>
+                <w:b/>
+              </w:rPr>
+              <w:t>Patients</w:t>
+            </w:r>
+          </w:p>
+        </w:tc>
+        <w:tc>
+          <w:tcPr>
+            <w:tcW w:type="dxa" w:w="2160"/>
+          </w:tcPr>
+          <w:p>
+            <w:r>
+              <w:rPr>
+                <w:b/>
+              </w:rPr>
+              <w:t>Samples</w:t>
+            </w:r>
+          </w:p>
+        </w:tc>
+        <w:tc>
+          <w:tcPr>
+            <w:tcW w:type="dxa" w:w="2160"/>
+          </w:tcPr>
+          <w:p>
+            <w:r>
+              <w:rPr>
+                <w:b/>
+              </w:rPr>
+              <w:t>% of Patients</w:t>
+            </w:r>
+          </w:p>
+        </w:tc>
+      </w:tr>
+      <w:tr>
+        <w:tc>
+          <w:tcPr>
+            <w:tcW w:type="dxa" w:w="2160"/>
+          </w:tcPr>
+          <w:p>
+            <w:r>
+              <w:t>True Positive</w:t>
+            </w:r>
+          </w:p>
+        </w:tc>
+        <w:tc>
+          <w:tcPr>
+            <w:tcW w:type="dxa" w:w="2160"/>
+          </w:tcPr>
+          <w:p>
+            <w:r>
+              <w:t>268</w:t>
+            </w:r>
+          </w:p>
+        </w:tc>
+        <w:tc>
+          <w:tcPr>
+            <w:tcW w:type="dxa" w:w="2160"/>
+          </w:tcPr>
+          <w:p>
+            <w:r>
+              <w:t>1,588</w:t>
+            </w:r>
+          </w:p>
+        </w:tc>
+        <w:tc>
+          <w:tcPr>
+            <w:tcW w:type="dxa" w:w="2160"/>
+          </w:tcPr>
+          <w:p>
+            <w:r>
+              <w:t>4.4%</w:t>
+            </w:r>
+          </w:p>
+        </w:tc>
+      </w:tr>
+      <w:tr>
+        <w:tc>
+          <w:tcPr>
+            <w:tcW w:type="dxa" w:w="2160"/>
+          </w:tcPr>
+          <w:p>
+            <w:r>
+              <w:t>True Negative</w:t>
+            </w:r>
+          </w:p>
+        </w:tc>
+        <w:tc>
+          <w:tcPr>
+            <w:tcW w:type="dxa" w:w="2160"/>
+          </w:tcPr>
+          <w:p>
+            <w:r>
+              <w:t>4,303</w:t>
+            </w:r>
+          </w:p>
+        </w:tc>
+        <w:tc>
+          <w:tcPr>
+            <w:tcW w:type="dxa" w:w="2160"/>
+          </w:tcPr>
+          <w:p>
+            <w:r>
+              <w:t>220,734</w:t>
+            </w:r>
+          </w:p>
+        </w:tc>
+        <w:tc>
+          <w:tcPr>
+            <w:tcW w:type="dxa" w:w="2160"/>
+          </w:tcPr>
+          <w:p>
+            <w:r>
+              <w:t>71.1%</w:t>
+            </w:r>
+          </w:p>
+        </w:tc>
+      </w:tr>
+      <w:tr>
+        <w:tc>
+          <w:tcPr>
+            <w:tcW w:type="dxa" w:w="2160"/>
+          </w:tcPr>
+          <w:p>
+            <w:r>
+              <w:t>False Positive</w:t>
+            </w:r>
+          </w:p>
+        </w:tc>
+        <w:tc>
+          <w:tcPr>
+            <w:tcW w:type="dxa" w:w="2160"/>
+          </w:tcPr>
+          <w:p>
+            <w:r>
+              <w:t>1,290</w:t>
+            </w:r>
+          </w:p>
+        </w:tc>
+        <w:tc>
+          <w:tcPr>
+            <w:tcW w:type="dxa" w:w="2160"/>
+          </w:tcPr>
+          <w:p>
+            <w:r>
+              <w:t>11,555</w:t>
+            </w:r>
+          </w:p>
+        </w:tc>
+        <w:tc>
+          <w:tcPr>
+            <w:tcW w:type="dxa" w:w="2160"/>
+          </w:tcPr>
+          <w:p>
+            <w:r>
+              <w:t>21.3%</w:t>
+            </w:r>
+          </w:p>
+        </w:tc>
+      </w:tr>
+      <w:tr>
+        <w:tc>
+          <w:tcPr>
+            <w:tcW w:type="dxa" w:w="2160"/>
+          </w:tcPr>
+          <w:p>
+            <w:r>
+              <w:t>False Negative</w:t>
+            </w:r>
+          </w:p>
+        </w:tc>
+        <w:tc>
+          <w:tcPr>
+            <w:tcW w:type="dxa" w:w="2160"/>
+          </w:tcPr>
+          <w:p>
+            <w:r>
+              <w:t>190</w:t>
+            </w:r>
+          </w:p>
+        </w:tc>
+        <w:tc>
+          <w:tcPr>
+            <w:tcW w:type="dxa" w:w="2160"/>
+          </w:tcPr>
+          <w:p>
+            <w:r>
+              <w:t>2,777</w:t>
+            </w:r>
+          </w:p>
+        </w:tc>
+        <w:tc>
+          <w:tcPr>
+            <w:tcW w:type="dxa" w:w="2160"/>
+          </w:tcPr>
+          <w:p>
+            <w:r>
+              <w:t>3.1%</w:t>
+            </w:r>
+          </w:p>
+        </w:tc>
+      </w:tr>
+      <w:tr>
+        <w:tc>
+          <w:tcPr>
+            <w:tcW w:type="dxa" w:w="2160"/>
+          </w:tcPr>
+          <w:p>
+            <w:r>
+              <w:rPr>
+                <w:b/>
+              </w:rPr>
+              <w:t>Total</w:t>
+            </w:r>
+          </w:p>
+        </w:tc>
+        <w:tc>
+          <w:tcPr>
+            <w:tcW w:type="dxa" w:w="2160"/>
+          </w:tcPr>
+          <w:p>
+            <w:r>
+              <w:rPr>
+                <w:b/>
+              </w:rPr>
+              <w:t>6,051</w:t>
+            </w:r>
+          </w:p>
+        </w:tc>
+        <w:tc>
+          <w:tcPr>
+            <w:tcW w:type="dxa" w:w="2160"/>
+          </w:tcPr>
+          <w:p>
+            <w:r>
+              <w:rPr>
+                <w:b/>
+              </w:rPr>
+              <w:t>236,654</w:t>
+            </w:r>
+          </w:p>
+        </w:tc>
+        <w:tc>
+          <w:tcPr>
+            <w:tcW w:type="dxa" w:w="2160"/>
+          </w:tcPr>
+          <w:p>
+            <w:r>
+              <w:rPr>
+                <w:b/>
+              </w:rPr>
+              <w:t>100%</w:t>
+            </w:r>
+          </w:p>
+        </w:tc>
+      </w:tr>
+    </w:tbl>
+    <w:p>
       <w:pPr>
         <w:pStyle w:val="Heading2"/>
       </w:pPr>

</xml_diff>

<commit_message>
Fix report structure and remove decorative splitters from code
Report: cleaned misplaced content from TOC area, added Sections 1-2
(Introduction, Dataset), fixed section 9 numbering (9.1-9.5),
removed duplicate references and empty paragraphs.

Code: removed all "=" * N and "-" * N decorative line separators from
run_analysis.py, evaluate_ensemble.py, and hyperopt.py. Replaced with
simple newlines for cleaner output.
</commit_message>
<xml_diff>
--- a/outputs/docs/sepsis_project_report.docx
+++ b/outputs/docs/sepsis_project_report.docx
@@ -2,8 +2,6 @@
 <file path=word/document.xml><?xml version="1.0" encoding="utf-8"?>
 <w:document xmlns:wpc="http://schemas.microsoft.com/office/word/2010/wordprocessingCanvas" xmlns:mo="http://schemas.microsoft.com/office/mac/office/2008/main" xmlns:mc="http://schemas.openxmlformats.org/markup-compatibility/2006" xmlns:mv="urn:schemas-microsoft-com:mac:vml" xmlns:o="urn:schemas-microsoft-com:office:office" xmlns:r="http://schemas.openxmlformats.org/officeDocument/2006/relationships" xmlns:m="http://schemas.openxmlformats.org/officeDocument/2006/math" xmlns:v="urn:schemas-microsoft-com:vml" xmlns:wp14="http://schemas.microsoft.com/office/word/2010/wordprocessingDrawing" xmlns:wp="http://schemas.openxmlformats.org/drawingml/2006/wordprocessingDrawing" xmlns:w10="urn:schemas-microsoft-com:office:word" xmlns:w="http://schemas.openxmlformats.org/wordprocessingml/2006/main" xmlns:w14="http://schemas.microsoft.com/office/word/2010/wordml" xmlns:wpg="http://schemas.microsoft.com/office/word/2010/wordprocessingGroup" xmlns:wpi="http://schemas.microsoft.com/office/word/2010/wordprocessingInk" xmlns:wne="http://schemas.microsoft.com/office/word/2006/wordml" xmlns:wps="http://schemas.microsoft.com/office/word/2010/wordprocessingShape" mc:Ignorable="w14 wp14">
   <w:body>
-    <w:p/>
-    <w:p/>
     <w:p>
       <w:pPr>
         <w:jc w:val="center"/>
@@ -83,29 +81,11 @@
       </w:r>
     </w:p>
     <w:p>
-      <w:pPr/>
-      <w:r>
-        <w:t>The preprocessing pipeline transforms raw PSV files into model-ready tensors. Raw features consist of 8 vital signs (HR, O2Sat, Temp, SBP, MAP, DBP, Resp, EtCO2), 26 laboratory values, and 6 demographic variables (40 total). The pipeline applies forward-fill imputation to maintain temporal continuity, then generates missingness masks (binary indicators of whether each value was observed) and time-since features (hours since last observation). This produces 40 raw + 40 masks + 40 time_since = 120 features per timestep. All features are z-score normalized using population-level training statistics.</w:t>
-      </w:r>
-    </w:p>
-    <w:p>
-      <w:pPr/>
-      <w:r>
-        <w:t>A hash-based caching system stores preprocessed data to ensure reproducibility and avoid redundant computation. The cache is invalidated when raw data or preprocessing parameters change.</w:t>
-      </w:r>
-    </w:p>
-    <w:p>
       <w:pPr>
         <w:spacing w:after="40" w:before="0"/>
       </w:pPr>
       <w:r>
         <w:t>4. Feature Engineering</w:t>
-      </w:r>
-    </w:p>
-    <w:p>
-      <w:pPr/>
-      <w:r>
-        <w:t>Class Imbalance Handling: The dataset exhibits severe class imbalance with only 1.84% sepsis prevalence (4,365 positive out of 236,654 total samples). A positive class weight of 54.86 is computed as the negative/positive ratio, then scaled by a pos_weight_multiplier of 0.5 (Optuna-optimized) for the GRU loss function. SMOTE was not used as it is ineffective for sequential/temporal data where sample interdependence matters. Undersampling was avoided to preserve valuable negative patterns critical for specificity.</w:t>
       </w:r>
     </w:p>
     <w:p>
@@ -133,30 +113,6 @@
       </w:r>
     </w:p>
     <w:p>
-      <w:pPr/>
-      <w:r>
-        <w:t>The improved LightGBM expands the 120 base features to 244 through systematic feature engineering:</w:t>
-      </w:r>
-    </w:p>
-    <w:p>
-      <w:pPr/>
-      <w:r>
-        <w:t>Feature groups: Base features (120) = 40 raw + 40 masks + 40 time_since; 6h rolling stats (40) = mean/min/max/std + slope for 8 vitals; 12h rolling stats (32) = mean/min/max/std for 8 vitals; 24h rolling stats (32) = mean/min/max/std for 8 vitals; Rate of change (8) = current - 6h ago for vitals; Time-weighted average (8) = exponential decay with half-life=3h; Clinical interactions (4) = HR*SBP product, MAP 6h trend, Resp*HR product, absolute temperature deviation.</w:t>
-      </w:r>
-    </w:p>
-    <w:p>
-      <w:pPr/>
-      <w:r>
-        <w:t>Hyperparameters: num_leaves=127, learning_rate=0.05, min_data_in_leaf=100, reg_alpha=0.01, reg_lambda=0.01, 500 boosting rounds (no early stopping).</w:t>
-      </w:r>
-    </w:p>
-    <w:p>
-      <w:pPr/>
-      <w:r>
-        <w:t>Why 500 trees is optimal: At 500 trees, validation loss=0.148 and utility=0.3976. At 1000 trees, validation loss drops to 0.097 but utility decreases to 0.3871. This is classic overfitting: the model fits validation loss better but produces less clinically useful predictions. The utility score penalizes both missed sepsis and false alarms in ways that raw loss does not capture.</w:t>
-      </w:r>
-    </w:p>
-    <w:p>
       <w:pPr>
         <w:spacing w:after="40" w:before="0"/>
       </w:pPr>
@@ -178,12 +134,6 @@
       </w:pPr>
       <w:r>
         <w:t>6. Training Methodology</w:t>
-      </w:r>
-    </w:p>
-    <w:p>
-      <w:pPr/>
-      <w:r>
-        <w:t>Training curve milestones: Epoch 1: Utility 0.206, Val Loss 1.115. Epoch 10: Utility 0.276, Val Loss 1.259. Epoch 20: Utility 0.256, Val Loss 1.144. Epoch 37: Utility 0.337, Val Loss 1.903 (best checkpoint saved). Epoch 47: Early stopping triggered after 10 epochs without improvement. Note that the best utility occurs at higher validation loss, indicating the model learns to optimize for clinical relevance rather than raw prediction accuracy.</w:t>
       </w:r>
     </w:p>
     <w:p>
@@ -211,43 +161,33 @@
       </w:r>
     </w:p>
     <w:p>
-      <w:pPr>
-        <w:spacing w:after="40" w:before="0"/>
-      </w:pPr>
+      <w:pPr/>
       <w:r>
         <w:t xml:space="preserve">   9.1 Individual Model Performance</w:t>
       </w:r>
     </w:p>
     <w:p>
-      <w:pPr>
-        <w:spacing w:after="40" w:before="0"/>
-      </w:pPr>
+      <w:pPr/>
       <w:r>
-        <w:t xml:space="preserve">   9.2 Ensemble Strategy</w:t>
-      </w:r>
-    </w:p>
-    <w:p>
-      <w:pPr>
-        <w:spacing w:after="40" w:before="0"/>
-      </w:pPr>
-      <w:r>
-        <w:t xml:space="preserve">   9.3 Classification Metrics</w:t>
-      </w:r>
-    </w:p>
-    <w:p>
-      <w:r>
-        <w:t xml:space="preserve">   9.4 Prediction Timing Analysis</w:t>
+        <w:t xml:space="preserve">   9.2 Classification Metrics</w:t>
       </w:r>
     </w:p>
     <w:p>
       <w:pPr/>
       <w:r>
-        <w:t xml:space="preserve">   9.5 Model Agreement Analysis</w:t>
+        <w:t xml:space="preserve">   9.3 Prediction Timing Analysis</w:t>
       </w:r>
     </w:p>
     <w:p>
+      <w:pPr/>
       <w:r>
-        <w:t xml:space="preserve">   9.6 Comparison to PhysioNet Winners</w:t>
+        <w:t xml:space="preserve">   9.4 Model Agreement Analysis</w:t>
+      </w:r>
+    </w:p>
+    <w:p>
+      <w:pPr/>
+      <w:r>
+        <w:t xml:space="preserve">   9.5 Comparison to PhysioNet Winners</w:t>
       </w:r>
     </w:p>
     <w:p>
@@ -267,64 +207,45 @@
       </w:r>
     </w:p>
     <w:p>
-      <w:pPr/>
+      <w:pPr>
+        <w:pStyle w:val="Heading1"/>
+      </w:pPr>
       <w:r>
-        <w:t>This project developed an ensemble sepsis forecasting system achieving 0.4060 utility on the PhysioNet 2019 Challenge validation set, placing it within the winner range (0.36-0.43). The ensemble combines a bidirectional GRU with temporal attention (0.3374 utility) and an improved LightGBM with 244 engineered features (0.3976 utility) using a max strategy.</w:t>
+        <w:t>1. Introduction</w:t>
       </w:r>
     </w:p>
     <w:p>
       <w:pPr/>
       <w:r>
-        <w:t>Key findings: (1) Feature engineering provided greater performance gains than architectural complexity, with LightGBM's 244 features outperforming the GRU's learned representations. (2) The models exhibit complementary detection patterns, with only 27.7% overlap in true positive predictions, explaining the ensemble's 20% improvement over GRU alone. (3) SHAP analysis revealed that time_since features dominate GRU predictions, indicating the model learned that when labs are ordered predicts sepsis better than the lab values themselves. (4) 60.1% of ensemble true positives occur in the optimal -6h to 0h window, compared to 47.4% for GRU alone.</w:t>
+        <w:t>Sepsis is a life-threatening organ dysfunction caused by a dysregulated host response to infection, affecting approximately 1.7 million adults in the United States annually with mortality rates of 25-30%. Early recognition and treatment are critical, as each hour of delayed intervention increases mortality by 4-8%. This project develops a machine learning system for early sepsis prediction using the PhysioNet/Computing in Cardiology Challenge 2019 dataset, combining a bidirectional GRU with temporal attention and an improved LightGBM with 244 engineered features into an ensemble achieving a utility score of 0.4060.</w:t>
+      </w:r>
+    </w:p>
+    <w:p>
+      <w:pPr>
+        <w:pStyle w:val="Heading1"/>
+      </w:pPr>
+      <w:r>
+        <w:t>2. Dataset</w:t>
       </w:r>
     </w:p>
     <w:p>
       <w:pPr/>
       <w:r>
-        <w:t>The attention mechanism provides clinically interpretable explanations, consistently focusing on the most recent 3 hours of patient data. This aligns with clinical intuition that acute deterioration drives sepsis onset. Future work could explore additional feature engineering, calibrated probability outputs, and validation on external datasets.</w:t>
-      </w:r>
-    </w:p>
-    <w:p>
-      <w:r>
-        <w:t>References</w:t>
+        <w:t>The PhysioNet 2019 Challenge dataset contains hourly clinical recordings from 40,336 ICU patients across two hospital systems (Beth Israel Deaconess Medical Center and Emory University Hospital). Each patient record consists of 40 clinical variables: 8 vital signs (HR, O2Sat, Temp, SBP, MAP, DBP, Resp, EtCO2), 26 laboratory values (including blood gases, metabolic panels, and coagulation studies), and 6 demographic features (Age, Gender, Unit1/Unit2, HospAdmTime, ICULOS).</w:t>
       </w:r>
     </w:p>
     <w:p>
       <w:pPr/>
       <w:r>
-        <w:t>[1] Reyna, M.A., et al. "Early Prediction of Sepsis from Clinical Data: The PhysioNet/Computing in Cardiology Challenge 2019." Critical Care Medicine, 2019.</w:t>
+        <w:t>One of the most significant challenges of this dataset is the extreme degree of missingness. Vital signs are recorded most frequently but still exhibit 5-15% missingness, while laboratory values show 80-95% missingness as they are only measured when clinically indicated. This pattern of informative missingness, where the decision to order a lab test itself carries diagnostic information, motivates our use of missingness masks and time-since features.</w:t>
       </w:r>
     </w:p>
     <w:p>
       <w:pPr/>
       <w:r>
-        <w:t>[2] Ke, G., et al. "LightGBM: A Highly Efficient Gradient Boosting Decision Tree." Advances in Neural Information Processing Systems, 2017.</w:t>
+        <w:t>Class imbalance is another substantial challenge. Approximately 7% of patients develop sepsis during their ICU stay, but at the hourly sample level only 1.84% of observations carry a positive sepsis label (4,365 out of 236,654 validation samples). The dataset uses a 15% validation split at the patient level (6,051 patients), maintaining temporal integrity by never splitting a single patient across train and validation sets.</w:t>
       </w:r>
     </w:p>
-    <w:p>
-      <w:pPr/>
-      <w:r>
-        <w:t>[3] Lundberg, S.M. &amp; Lee, S.I. "A Unified Approach to Interpreting Model Predictions." Advances in Neural Information Processing Systems, 2017.</w:t>
-      </w:r>
-    </w:p>
-    <w:p>
-      <w:pPr/>
-      <w:r>
-        <w:t>[4] Bahdanau, D., Cho, K. &amp; Bengio, Y. "Neural Machine Translation by Jointly Learning to Align and Translate." ICLR, 2015.</w:t>
-      </w:r>
-    </w:p>
-    <w:p>
-      <w:pPr/>
-      <w:r>
-        <w:t>[5] Cho, K., et al. "Learning Phrase Representations using RNN Encoder-Decoder for Statistical Machine Translation." EMNLP, 2014.</w:t>
-      </w:r>
-    </w:p>
-    <w:p>
-      <w:r>
-        <w:t>The 40 clinical variables are organized into three physiological categories. The first group consists of 8 vital signs that are recorded most frequently: heart rate (HR), oxygen saturation (O2Sat), temperature (Temp), systolic blood pressure (SBP), mean arterial pressure (MAP), diastolic blood pressure (DBP), respiration rate (Resp), and end-tidal CO2 (EtCO2). The second group comprises 26 laboratory values that are measured intermittently as part of clinical care, including metabolic panels (glucose, creatinine, BUN, electrolytes), liver function tests (bilirubin, AST, alkaline phosphatase), hematological parameters (WBC, platelets, hemoglobin, hematocrit), coagulation markers (PTT, fibrinogen), blood gas measurements (pH, PaCO2, PaO2, SaO2, base excess, HCO3, FiO2), and the critical sepsis biomarker lactate. The third group contains 6 demographic and administrative variables: age, gender, ICU unit identifiers (Unit1, Unit2), time of hospital admission relative to ICU admission (HospAdmTime), and ICU length of stay in hours (ICULOS).</w:t>
-      </w:r>
-    </w:p>
-    <w:p/>
     <w:tbl>
       <w:tblPr>
         <w:tblStyle w:val="TableGrid"/>
@@ -677,17 +598,6 @@
         </w:tc>
       </w:tr>
     </w:tbl>
-    <w:p/>
-    <w:p>
-      <w:r>
-        <w:t>One of the most significant challenges of this dataset is the extreme degree of missingness in the clinical variables. Vital signs, which are recorded by bedside monitors, exhibit relatively modest missingness rates of approximately 1-15%. However, laboratory values are measured only when clinically indicated, resulting in missingness rates that commonly exceed 80% and reach as high as 97% for certain analytes such as EtCO2, fibrinogen, and troponin I. This missingness is not random; it is informative. The decision to order a laboratory test is itself a clinical action driven by the clinician's assessment of the patient's condition. A sudden increase in laboratory ordering frequency may signal clinical concern about deterioration, even before the test results themselves reveal abnormalities. Our preprocessing pipeline explicitly captures these missingness patterns as features, as detailed in Section 3.</w:t>
-      </w:r>
-    </w:p>
-    <w:p>
-      <w:r>
-        <w:t>Class imbalance represents another substantial challenge. Approximately 7% of patients develop sepsis at some point during their ICU stay, and within those patients, the sepsis label is only positive for a subset of their hourly records, resulting in an overall hourly positive rate of roughly 1.8%. This severe imbalance means that a naive classifier predicting all-negative would achieve over 98% accuracy, rendering standard accuracy metrics useless for model evaluation. The challenge organizers addressed this by introducing a custom utility score that explicitly accounts for the clinical value of timely prediction, as described in Section 7.</w:t>
-      </w:r>
-    </w:p>
     <w:p>
       <w:pPr>
         <w:pStyle w:val="Heading1"/>
@@ -1115,7 +1025,6 @@
         </w:tc>
       </w:tr>
     </w:tbl>
-    <w:p/>
     <w:p>
       <w:r>
         <w:t>The 40 raw value features represent the normalized clinical measurements after forward-fill and population-level imputation. These include 8 vital signs that capture the patient's core physiological state (hemodynamics, oxygenation, temperature regulation), 26 laboratory values that reflect organ function and metabolic status, and 6 demographic variables that provide static patient context. After z-score normalization with winsorizing, these values are centered around zero with unit variance, ensuring that no single feature dominates the input simply due to its natural scale.</w:t>
@@ -1652,7 +1561,6 @@
         </w:tc>
       </w:tr>
     </w:tbl>
-    <w:p/>
     <w:p>
       <w:r>
         <w:t>For non-sepsis patients, each hour with a false positive prediction incurs a penalty of -0.05, reflecting the clinical cost of unnecessary interventions triggered by false alarms. True negative hours contribute zero utility, representing the baseline of correct non-action.</w:t>
@@ -1707,6 +1615,14 @@
       </w:pPr>
       <w:r>
         <w:t>9. Results</w:t>
+      </w:r>
+    </w:p>
+    <w:p>
+      <w:pPr>
+        <w:pStyle w:val="Heading2"/>
+      </w:pPr>
+      <w:r>
+        <w:t>9.1 Individual Model Performance</w:t>
       </w:r>
     </w:p>
     <w:p>
@@ -2067,7 +1983,6 @@
         </w:tc>
       </w:tr>
     </w:tbl>
-    <w:p/>
     <w:p>
       <w:r>
         <w:t>The results reveal a surprising finding: the improved LightGBM with 244 engineered features achieves a higher utility score (0.3976) than the GRU with temporal attention (0.3374). This contradicts the initial expectation that sequential deep learning would dominate tabular gradient boosting on time-series data. The key differentiator is feature engineering: while the GRU operates on 120 raw features and must learn temporal patterns implicitly through its recurrent architecture, the LightGBM benefits from explicit multi-scale rolling statistics (6h, 12h, 24h windows), rate-of-change features, and clinical interaction terms that directly encode domain knowledge.</w:t>
@@ -2440,7 +2355,7 @@
         <w:pStyle w:val="Heading2"/>
       </w:pPr>
       <w:r>
-        <w:t>9.5 Model Agreement Analysis</w:t>
+        <w:t>9.4 Model Agreement Analysis</w:t>
       </w:r>
     </w:p>
     <w:p>
@@ -2460,7 +2375,7 @@
         <w:pStyle w:val="Heading2"/>
       </w:pPr>
       <w:r>
-        <w:t>9.6 Comparison to PhysioNet 2019 Challenge Winners</w:t>
+        <w:t>9.5 Comparison to PhysioNet 2019 Challenge Winners</w:t>
       </w:r>
     </w:p>
     <w:p>
@@ -2626,6 +2541,12 @@
       </w:r>
     </w:p>
     <w:p>
+      <w:pPr/>
+      <w:r>
+        <w:t>Development was initially attempted under Windows Subsystem for Linux (WSL) for compatibility with the Linux-centric PyTorch ecosystem. However, WSL exhibited intermittent stability issues during long training runs, including unexpected process termination and filesystem synchronization delays. The project was ultimately developed in the native Windows environment with appropriate path handling, which provided more reliable long-running process execution.</w:t>
+      </w:r>
+    </w:p>
+    <w:p>
       <w:pPr>
         <w:pStyle w:val="Heading2"/>
       </w:pPr>
@@ -2651,11 +2572,6 @@
       <w:pPr/>
       <w:r>
         <w:t>A subtle but critical issue arose when computing clinical interaction features for the improved LightGBM. Ratio features such as shock index (HR/SBP) and respiratory-heart rate ratio (Resp/HR) produced NaN and Inf values because the underlying features are z-score normalized, meaning values frequently cross zero. The solution was to replace all ratio features with product features (HR*SBP, Resp*HR), which are equally informative for tree-based models while avoiding numerical instability.</w:t>
-      </w:r>
-    </w:p>
-    <w:p>
-      <w:r>
-        <w:t>Development was initially attempted under Windows Subsystem for Linux (WSL) for compatibility with the Linux-centric PyTorch ecosystem. However, WSL exhibited intermittent stability issues during long training runs, including unexpected process termination and filesystem synchronization delays. The project was ultimately developed in the native Windows environment with appropriate path handling, which provided more reliable long-running process execution.</w:t>
       </w:r>
     </w:p>
     <w:p>

</xml_diff>

<commit_message>
Add LightGBM vs GRU temporal handling and ensemble complementarity to report
</commit_message>
<xml_diff>
--- a/outputs/docs/sepsis_project_report.docx
+++ b/outputs/docs/sepsis_project_report.docx
@@ -1067,6 +1067,18 @@
       </w:r>
     </w:p>
     <w:p>
+      <w:pPr/>
+      <w:r>
+        <w:t>LightGBM (Light Gradient Boosting Machine) is a gradient boosting framework that builds an ensemble of decision trees sequentially, where each new tree corrects the errors of the previous ones. Unlike neural networks that learn representations from raw data, decision trees operate on fixed tabular features: at each split node, the tree selects a single feature and a threshold value to partition the data. This means LightGBM has no inherent notion of time or sequence order. It treats each hourly observation as an independent row of features, with no awareness that consecutive rows come from the same patient or that earlier rows precede later ones.</w:t>
+      </w:r>
+    </w:p>
+    <w:p>
+      <w:pPr/>
+      <w:r>
+        <w:t>To compensate for this lack of temporal awareness, LightGBM relies entirely on hand-crafted temporal features. The ICULOS (ICU Length of Stay) feature gives the model a sense of where each observation falls in the patient's timeline. The time_since features (hours since each variable was last measured) encode recency of clinical observations. Rolling statistics over 6-hour, 12-hour, and 24-hour windows summarize recent trends as static values that the tree can split on. Rate-of-change features (current value minus the value 6 hours ago) capture velocity of physiological change. Time-weighted exponential averages with a 3-hour half-life provide smoothed trajectories. In effect, the feature engineering translates the temporal structure of the ICU time series into a flat tabular representation that a tree-based model can reason about. The quality of these engineered features directly determines how well LightGBM can capture temporal dynamics, which is why the improved model (244 features) dramatically outperforms the baseline (160 features) with utility scores of 0.3976 versus 0.137.</w:t>
+      </w:r>
+    </w:p>
+    <w:p>
       <w:r>
         <w:t>Gradient boosted decision trees have established themselves as strong baselines for tabular clinical data, and LightGBM in particular offers efficient training with built-in handling of class imbalance. The baseline model operates on a flattened feature representation: for each hourly prediction, the 120 preprocessed features are augmented with rolling window statistics (mean, min, max, standard deviation) and trend features (linear regression slope) computed over the preceding 6 hours for each of the 8 vital signs. This produces 120 + 8 x 5 = 160 features per sample, capturing recent temporal context without requiring a sequential model architecture.</w:t>
       </w:r>
@@ -1116,6 +1128,18 @@
       </w:r>
     </w:p>
     <w:p>
+      <w:pPr/>
+      <w:r>
+        <w:t>The Gated Recurrent Unit (GRU) is a recurrent neural network architecture designed specifically for sequential data. Unlike LightGBM, which sees each hourly observation in isolation, the GRU processes the entire 24-hour patient window step by step, maintaining a hidden state that accumulates information from all previous timesteps. At each hour, the GRU's update gate decides how much of the previous hidden state to retain, while the reset gate controls how much past information to discard. This gating mechanism allows the model to automatically learn which temporal patterns matter, such as a gradual heart rate increase over 6 hours or a sudden drop in blood pressure, without requiring explicit feature engineering.</w:t>
+      </w:r>
+    </w:p>
+    <w:p>
+      <w:pPr/>
+      <w:r>
+        <w:t>The key advantage of the GRU over tree-based models is that it learns temporal representations directly from the raw feature sequences. Where LightGBM needs hand-crafted rolling means and rate-of-change features to detect trends, the GRU discovers these patterns implicitly through its recurrent structure. The bidirectional configuration processes the input window in both forward (past to present) and backward (present to past) directions, allowing the model to use future context within the window to better interpret earlier observations. For example, an elevated heart rate at hour 5 is more concerning if temperature spikes at hour 8, and the backward pass captures this relationship.</w:t>
+      </w:r>
+    </w:p>
+    <w:p>
       <w:r>
         <w:t>The primary model employs a Gated Recurrent Unit (GRU) architecture augmented with temporal attention. GRUs were selected over Long Short-Term Memory (LSTM) networks based on several practical considerations. Both architectures are capable of learning long-range temporal dependencies, but GRUs achieve comparable performance with fewer parameters due to their simpler gating structure (two gates versus LSTM's three). This reduction in parameters leads to faster training and lower memory consumption, which is relevant when training on a consumer GPU with 8 GB of VRAM. Additionally, empirical evidence in the clinical time-series literature suggests that GRUs perform on par with LSTMs for ICU prediction tasks where the relevant temporal patterns span hours to days rather than the much longer dependencies that might favor LSTMs.</w:t>
       </w:r>
@@ -1146,6 +1170,24 @@
       </w:pPr>
       <w:r>
         <w:t>5.4 Architectural Considerations</w:t>
+      </w:r>
+    </w:p>
+    <w:p>
+      <w:pPr/>
+      <w:r>
+        <w:t>The GRU and LightGBM models contribute to the ensemble in fundamentally different ways because they approach the prediction task from opposite directions. The GRU learns temporal dynamics directly from raw sequences, focusing on patterns in missingness timing and sequential feature evolution. SHAP analysis reveals that the GRU's most important features are time_since variables (FiO2_time_since, Alkalinephos_time_since, PaCO2_time_since), meaning the model learned that when clinicians order certain lab tests is itself a strong predictor of sepsis. This is a temporal pattern that emerges from the sequence structure and would be difficult to capture with hand-crafted features.</w:t>
+      </w:r>
+    </w:p>
+    <w:p>
+      <w:pPr/>
+      <w:r>
+        <w:t>LightGBM, by contrast, excels at exploiting explicit statistical features computed from the time series. Its top features are ICULOS (how long the patient has been in the ICU), HospAdmTime (time since hospital admission), and rolling statistics like Temp_rolling_max and MAP_rolling_min. These are concrete, interpretable quantities that decision trees can efficiently partition. LightGBM is particularly effective at detecting patients with abnormal vital sign trajectories over specific time windows, catching cases where temperature steadily climbs or blood pressure trends downward over 12-24 hours.</w:t>
+      </w:r>
+    </w:p>
+    <w:p>
+      <w:pPr/>
+      <w:r>
+        <w:t>The complementarity between the two models is quantified by their agreement analysis: only 27.7% of true positive detections are found by both models. The GRU uniquely identifies 16.8% of true positives, typically cases where subtle temporal ordering of lab test requests signals deterioration before the lab values themselves become abnormal. LightGBM uniquely identifies 55.5% of true positives, often cases with clear statistical deviations in rolling vital sign features that the GRU's learned representations underweight. The max ensemble strategy leverages this complementarity: rather than averaging the two predictions (which dilutes confident detections), it takes the maximum, ensuring that if either model detects sepsis, the ensemble flags the patient. This produces a 20% improvement in utility over the GRU alone (0.4060 vs 0.3374).</w:t>
       </w:r>
     </w:p>
     <w:p>

</xml_diff>